<commit_message>
Rechnungsvorlage: Verzugshinweis ergänzt, Aufbewahrungshinweis-Text hat Fehler
- public/downloads/rechnungsvorlage.docx aktualisiert: Verzugshinweis
  (§ 286 Abs. 3 BGB) korrekt ergänzt, Newsletter-Behauptung dazu wieder
  hergestellt
- Der neu eingefügte Aufbewahrungshinweis-Satz im Dokument ist fachlich
  nicht korrekt (falsche/nicht existente Norm "§ 14b Abs. 4 Nr. 9", fehlender
  Grundstücksbezug, falsche 10-Jahres-Angabe für gewerbliche Kunden) -
  Korrektur dem Nutzer im Chat vorgeschlagen, Newsletter-Text bewusst nicht
  auf diesen Satz gestützt
</commit_message>
<xml_diff>
--- a/public/downloads/rechnungsvorlage.docx
+++ b/public/downloads/rechnungsvorlage.docx
@@ -1408,6 +1408,11 @@
             <w:tcW w:w="9062" w:type="dxa"/>
           </w:tcPr>
           <w:p>
+            <w:pPr>
+              <w:rPr>
+                <w:rFonts w:ascii="Arial" w:hAnsi="Arial" w:cs="Arial"/>
+              </w:rPr>
+            </w:pPr>
             <w:r>
               <w:rPr>
                 <w:rFonts w:ascii="Arial" w:hAnsi="Arial" w:cs="Arial"/>
@@ -1426,6 +1431,112 @@
               </w:rPr>
               <w:t xml:space="preserve"> Tagen auf unser unten genanntes Konto.</w:t>
             </w:r>
+          </w:p>
+          <w:p>
+            <w:pPr>
+              <w:rPr>
+                <w:rFonts w:ascii="Arial" w:hAnsi="Arial" w:cs="Arial"/>
+              </w:rPr>
+            </w:pPr>
+          </w:p>
+          <w:p>
+            <w:pPr>
+              <w:rPr>
+                <w:rFonts w:ascii="Arial" w:hAnsi="Arial" w:cs="Arial"/>
+              </w:rPr>
+            </w:pPr>
+            <w:r>
+              <w:rPr>
+                <w:rFonts w:ascii="Arial" w:hAnsi="Arial" w:cs="Arial"/>
+              </w:rPr>
+              <w:t>Bei Zahlungsverzug geraten Sie spätestens 30 Tage nach Fälligkeit und Zugang dieser Rechnung gemäß § 286 Abs. 3 BGB automatisch in Verzug, sofern die Zahlung bis dahin nicht bei uns eingegangen ist.</w:t>
+            </w:r>
+          </w:p>
+          <w:p>
+            <w:pPr>
+              <w:rPr>
+                <w:rFonts w:ascii="Arial" w:hAnsi="Arial" w:cs="Arial"/>
+              </w:rPr>
+            </w:pPr>
+          </w:p>
+          <w:p>
+            <w:pPr>
+              <w:rPr>
+                <w:rFonts w:ascii="Arial" w:hAnsi="Arial" w:cs="Arial"/>
+              </w:rPr>
+            </w:pPr>
+          </w:p>
+          <w:p>
+            <w:pPr>
+              <w:rPr>
+                <w:rFonts w:ascii="Arial" w:hAnsi="Arial" w:cs="Arial"/>
+              </w:rPr>
+            </w:pPr>
+          </w:p>
+          <w:p>
+            <w:pPr>
+              <w:rPr>
+                <w:rFonts w:ascii="Arial" w:hAnsi="Arial" w:cs="Arial"/>
+              </w:rPr>
+            </w:pPr>
+          </w:p>
+          <w:p>
+            <w:pPr>
+              <w:rPr>
+                <w:rFonts w:ascii="Arial" w:hAnsi="Arial" w:cs="Arial"/>
+              </w:rPr>
+            </w:pPr>
+          </w:p>
+          <w:p>
+            <w:pPr>
+              <w:rPr>
+                <w:rFonts w:ascii="Arial" w:hAnsi="Arial" w:cs="Arial"/>
+              </w:rPr>
+            </w:pPr>
+            <w:r>
+              <w:rPr>
+                <w:rFonts w:ascii="Arial" w:hAnsi="Arial" w:cs="Arial"/>
+              </w:rPr>
+              <w:t xml:space="preserve">Hinweis: </w:t>
+            </w:r>
+            <w:r>
+              <w:rPr>
+                <w:rFonts w:ascii="Arial" w:hAnsi="Arial" w:cs="Arial"/>
+              </w:rPr>
+              <w:t>Die Aufbewahrungsfrist dieser Rechnung, gem.</w:t>
+            </w:r>
+            <w:r>
+              <w:rPr>
+                <w:rFonts w:ascii="Arial" w:hAnsi="Arial" w:cs="Arial"/>
+              </w:rPr>
+              <w:t xml:space="preserve"> </w:t>
+            </w:r>
+            <w:r>
+              <w:rPr>
+                <w:rFonts w:ascii="Arial" w:hAnsi="Arial" w:cs="Arial"/>
+              </w:rPr>
+              <w:t xml:space="preserve">§ 14b Abs. </w:t>
+            </w:r>
+            <w:r>
+              <w:rPr>
+                <w:rFonts w:ascii="Arial" w:hAnsi="Arial" w:cs="Arial"/>
+              </w:rPr>
+              <w:t>4 Nr. 9,</w:t>
+            </w:r>
+            <w:r>
+              <w:rPr>
+                <w:rFonts w:ascii="Arial" w:hAnsi="Arial" w:cs="Arial"/>
+              </w:rPr>
+              <w:t xml:space="preserve"> </w:t>
+            </w:r>
+            <w:r>
+              <w:rPr>
+                <w:rFonts w:ascii="Arial" w:hAnsi="Arial" w:cs="Arial"/>
+              </w:rPr>
+              <w:t>beträgt für private Leistungsempfänger 2 Jahre. Für gewerbliche Leistungsempfänger 10 Jahre</w:t>
+            </w:r>
+          </w:p>
+          <w:p>
             <w:r>
               <w:rPr>
                 <w:rFonts w:ascii="Arial" w:hAnsi="Arial" w:cs="Arial"/>
@@ -2024,7 +2135,27 @@
               <w:sz w:val="16"/>
               <w:szCs w:val="16"/>
             </w:rPr>
-            <w:t xml:space="preserve"> USt-IdNr. </w:t>
+            <w:t xml:space="preserve"> USt-</w:t>
+          </w:r>
+          <w:proofErr w:type="spellStart"/>
+          <w:r>
+            <w:rPr>
+              <w:rFonts w:ascii="Arial" w:hAnsi="Arial" w:cs="Arial"/>
+              <w:color w:val="808080" w:themeColor="background1" w:themeShade="80"/>
+              <w:sz w:val="16"/>
+              <w:szCs w:val="16"/>
+            </w:rPr>
+            <w:t>IdNr</w:t>
+          </w:r>
+          <w:proofErr w:type="spellEnd"/>
+          <w:r>
+            <w:rPr>
+              <w:rFonts w:ascii="Arial" w:hAnsi="Arial" w:cs="Arial"/>
+              <w:color w:val="808080" w:themeColor="background1" w:themeShade="80"/>
+              <w:sz w:val="16"/>
+              <w:szCs w:val="16"/>
+            </w:rPr>
+            <w:t xml:space="preserve">. </w:t>
           </w:r>
           <w:r>
             <w:rPr>
@@ -2686,7 +2817,6 @@
   <w:style w:type="character" w:default="1" w:styleId="Absatz-Standardschriftart">
     <w:name w:val="Default Paragraph Font"/>
     <w:uiPriority w:val="1"/>
-    <w:semiHidden/>
     <w:unhideWhenUsed/>
   </w:style>
   <w:style w:type="table" w:default="1" w:styleId="NormaleTabelle">
@@ -2951,6 +3081,7 @@
     <w:rsid w:val="000014B2"/>
     <w:rsid w:val="00057DEA"/>
     <w:rsid w:val="001D5084"/>
+    <w:rsid w:val="00256652"/>
     <w:rsid w:val="004E6C19"/>
     <w:rsid w:val="00582051"/>
     <w:rsid w:val="005D220A"/>
@@ -2962,6 +3093,7 @@
     <w:rsid w:val="00A85840"/>
     <w:rsid w:val="00B17F53"/>
     <w:rsid w:val="00BA7E46"/>
+    <w:rsid w:val="00D05B13"/>
     <w:rsid w:val="00F30B8B"/>
     <w:rsid w:val="00FA4DCD"/>
   </w:rsids>

</xml_diff>

<commit_message>
Rechnungsvorlage: Aufbewahrungshinweis für Privatkunden korrekt formuliert (§ 14b Abs. 1 Satz 5 UStG)
</commit_message>
<xml_diff>
--- a/public/downloads/rechnungsvorlage.docx
+++ b/public/downloads/rechnungsvorlage.docx
@@ -1497,43 +1497,7 @@
               <w:rPr>
                 <w:rFonts w:ascii="Arial" w:hAnsi="Arial" w:cs="Arial"/>
               </w:rPr>
-              <w:t xml:space="preserve">Hinweis: </w:t>
-            </w:r>
-            <w:r>
-              <w:rPr>
-                <w:rFonts w:ascii="Arial" w:hAnsi="Arial" w:cs="Arial"/>
-              </w:rPr>
-              <w:t>Die Aufbewahrungsfrist dieser Rechnung, gem.</w:t>
-            </w:r>
-            <w:r>
-              <w:rPr>
-                <w:rFonts w:ascii="Arial" w:hAnsi="Arial" w:cs="Arial"/>
-              </w:rPr>
-              <w:t xml:space="preserve"> </w:t>
-            </w:r>
-            <w:r>
-              <w:rPr>
-                <w:rFonts w:ascii="Arial" w:hAnsi="Arial" w:cs="Arial"/>
-              </w:rPr>
-              <w:t xml:space="preserve">§ 14b Abs. </w:t>
-            </w:r>
-            <w:r>
-              <w:rPr>
-                <w:rFonts w:ascii="Arial" w:hAnsi="Arial" w:cs="Arial"/>
-              </w:rPr>
-              <w:t>4 Nr. 9,</w:t>
-            </w:r>
-            <w:r>
-              <w:rPr>
-                <w:rFonts w:ascii="Arial" w:hAnsi="Arial" w:cs="Arial"/>
-              </w:rPr>
-              <w:t xml:space="preserve"> </w:t>
-            </w:r>
-            <w:r>
-              <w:rPr>
-                <w:rFonts w:ascii="Arial" w:hAnsi="Arial" w:cs="Arial"/>
-              </w:rPr>
-              <w:t>beträgt für private Leistungsempfänger 2 Jahre. Für gewerbliche Leistungsempfänger 10 Jahre</w:t>
+              <w:t>Hinweis für Privatkunden: Bei Leistungen im Zusammenhang mit einem Grundstück (z. B. Einbaumöbel, Treppen) sind Sie verpflichtet, diese Rechnung, den Zahlungsbeleg oder eine andere beweiskräftige Unterlage zwei Jahre lang aufzubewahren (§ 14b Abs. 1 Satz 5 UStG).</w:t>
             </w:r>
           </w:p>
           <w:p>
@@ -3080,6 +3044,7 @@
     <w:rsidRoot w:val="00B17F53"/>
     <w:rsid w:val="000014B2"/>
     <w:rsid w:val="00057DEA"/>
+    <w:rsid w:val="001A6B24"/>
     <w:rsid w:val="001D5084"/>
     <w:rsid w:val="00256652"/>
     <w:rsid w:val="004E6C19"/>
@@ -3092,6 +3057,7 @@
     <w:rsid w:val="00A05CA2"/>
     <w:rsid w:val="00A85840"/>
     <w:rsid w:val="00B17F53"/>
+    <w:rsid w:val="00B70146"/>
     <w:rsid w:val="00BA7E46"/>
     <w:rsid w:val="00D05B13"/>
     <w:rsid w:val="00F30B8B"/>

</xml_diff>